<commit_message>
Bring the manuscript in line with the current model and test suite
The revised text now documents water as a CA barrier (rule 5), counts 69 tests
instead of 60, and quotes the measured 0.5 s forest inference. The Word copy is
rebuilt from the Markdown source.

🤖 Generated with Codebuff
Co-Authored-By: Codebuff <noreply@codebuff.com>
</commit_message>
<xml_diff>
--- a/docs/paper/INSIGHT-naskah-revisi.docx
+++ b/docs/paper/INSIGHT-naskah-revisi.docx
@@ -139,7 +139,7 @@
         <w:t>Random Forest</w:t>
       </w:r>
       <w:r>
-        <w:t xml:space="preserve"> dengan 200 pohon dan 11 fitur prediktor—termasuk riwayat titik panas 1–7 hari dan jarak ke titik panas hari sebelumnya—menyediakan peta risiko per sel yang dapat dijelaskan (ROC-AUC 0,883 pada pembagian temporal); apabila berkas model atau data FIRMS belum tersedia, sistem secara otomatis memakai baseline heuristik transparan agar simulasi tetap berjalan. Luaran yang diharapkan adalah prototipe perangkat lunak simulasi interaktif yang dapat memproyeksikan risiko kebakaran sekaligus memandu prioritas evakuasi habitat satwa dan perlindungan lahan gambut secara berkelanjutan.</w:t>
+        <w:t xml:space="preserve"> dengan 200 pohon dan 11 fitur prediktor—termasuk riwayat titik panas 1–7 hari dan jarak ke titik panas hari sebelumnya—menyediakan peta risiko per sel yang dapat dijelaskan (ROC-AUC 0,883 dan PR-AUC 0,283 pada pembagian temporal); apabila berkas model atau data FIRMS belum tersedia, sistem secara otomatis memakai baseline heuristik transparan agar simulasi tetap berjalan. Luaran yang diharapkan adalah prototipe perangkat lunak simulasi interaktif yang dapat memproyeksikan risiko kebakaran sekaligus memandu prioritas evakuasi habitat satwa dan perlindungan lahan gambut secara berkelanjutan.</w:t>
       </w:r>
     </w:p>
     <w:p>
@@ -407,7 +407,16 @@
         <w:jc w:val="both"/>
       </w:pPr>
       <w:r>
-        <w:t>Berbeda dari platform GIS konvensional yang statis, INSIGHT menjawab tema kompetisi "Physics for Future Solutions" dengan menggeser paradigma mitigasi karhutla dari pemantauan titik panas menuju proyeksi lintasan api dan perlindungan ekologis yang berkelanjutan. Seluruh parameter model dinyatakan terbuka dalam satu berkas konfigurasi, sehingga setiap angka pada simulasi dapat ditelusuri dan direproduksi.</w:t>
+        <w:t xml:space="preserve">Berbeda dari platform GIS konvensional yang statis, INSIGHT menjawab tema kompetisi "Physics for Future Solutions" dengan menggeser paradigma mitigasi karhutla dari pemantauan titik panas menuju proyeksi lintasan api dan perlindungan ekologis yang berkelanjutan. Seluruh parameter model dinyatakan terbuka dalam satu berkas konfigurasi, sehingga setiap angka dalam simulasi dapat ditelusuri dan direproduksi. Lapisan </w:t>
+      </w:r>
+      <w:r>
+        <w:rPr>
+          <w:i/>
+        </w:rPr>
+        <w:t>Machine Learning</w:t>
+      </w:r>
+      <w:r>
+        <w:t xml:space="preserve"> bukan hiasan: peta risiko pada kotak demo adalah keluaran model yang dilatih pada titik panas NASA FIRMS nyata, dan antarmuka selalu mencantumkan sumber serta metrik model tersebut.</w:t>
       </w:r>
     </w:p>
     <w:p>
@@ -1015,6 +1024,24 @@
     </w:p>
     <w:p>
       <w:pPr>
+        <w:pStyle w:val="ListBullet"/>
+      </w:pPr>
+      <w:r>
+        <w:t xml:space="preserve">Aturan 5 (air): sel yang ditandai air oleh mask OpenStreetMap tidak dapat terbakar, sehingga sungai dan danau memotong batas depan api. Seluruh sel daratan lain — termasuk permukiman dan sel </w:t>
+      </w:r>
+      <w:r>
+        <w:rPr>
+          <w:rFonts w:ascii="Consolas" w:hAnsi="Consolas"/>
+          <w:sz w:val="19"/>
+        </w:rPr>
+        <w:t>peat_risk</w:t>
+      </w:r>
+      <w:r>
+        <w:t xml:space="preserve"> — tetap dapat terbakar, dan titik panas yang jatuh di sel air tidak dipakai sebagai benih.</w:t>
+      </w:r>
+    </w:p>
+    <w:p>
+      <w:pPr>
         <w:jc w:val="both"/>
       </w:pPr>
       <w:r>
@@ -1209,7 +1236,7 @@
         <w:t>hanya dari hari-hari sebelum hari label</w:t>
       </w:r>
       <w:r>
-        <w:t xml:space="preserve"> (D−1 sampai D−7); hari label itu sendiri tidak pernah masuk, sehingga model tidak dapat menyalin label.</w:t>
+        <w:t xml:space="preserve"> (D−1 sampai D−7); hari label itu sendiri tidak pernah masuk, sehingga model tidak dapat menyalin label. Aturan ini diuji secara eksplisit: sel yang terbakar pada hari D harus bernilai 0 pada fitur riwayat hari D.</w:t>
       </w:r>
     </w:p>
     <w:p>
@@ -1243,7 +1270,7 @@
         <w:t>random_state = 42</w:t>
       </w:r>
       <w:r>
-        <w:t>. Pembobotan kelas seimbang diuji dan justru menurunkan kinerja pada pembagian temporal (ROC-AUC 0,863 vs 0,883; PR-AUC 0,222 vs 0,283), sekaligus menaikkan rata-rata probabilitas prediksi menjadi 0,24 padahal laju positif teramati 0,024.</w:t>
+        <w:t>. Pembobotan kelas seimbang diuji dan justru menurunkan kinerja pada pembagian temporal (ROC-AUC 0,863 vs 0,883; PR-AUC 0,222 vs 0,283), sekaligus menaikkan rata-rata probabilitas prediksi menjadi 0,24 padahal laju positif teramati 0,032.</w:t>
       </w:r>
     </w:p>
     <w:p>
@@ -1257,7 +1284,7 @@
         <w:t>Pembagian data:</w:t>
       </w:r>
       <w:r>
-        <w:t xml:space="preserve"> temporal, bukan acak. Delapan hari pengamatan dibagi menjadi 6 hari latih dan 2 hari uji (20.184 baris latih, 6.728 baris uji, 163 positif uji). Pembagian acak per baris akan menempatkan sel yang sama di kedua sisi dan menggelembungkan metrik.</w:t>
+        <w:t xml:space="preserve"> temporal, bukan acak. Delapan hari pengamatan dibagi menjadi 6 hari latih dan 2 hari uji (20.184 baris latih, 6.728 baris uji, 163 positif uji). Pembagian acak per baris akan menempatkan sel yang sama di kedua sisi dan menggelembungkan metrik, karena sebagian sel terbakar berulang.</w:t>
       </w:r>
     </w:p>
     <w:p>
@@ -1347,7 +1374,7 @@
         <w:t>models/risk_rf_metrics.json</w:t>
       </w:r>
       <w:r>
-        <w:t>. Aplikasi memuat kedua berkas itu saat inisialisasi; bila berkas tidak ada, aplikasi memakai baseline heuristik dan menampilkan sumber peta risiko di panel samping.</w:t>
+        <w:t>. Aplikasi memuat kedua berkas itu saat inisialisasi; bila berkas atau pustaka tidak tersedia, aplikasi memakai baseline heuristik dan menampilkan sumber peta risiko di panel samping.</w:t>
       </w:r>
     </w:p>
     <w:p>
@@ -1443,7 +1470,7 @@
         <w:jc w:val="both"/>
       </w:pPr>
       <w:r>
-        <w:t>dengan hasil dibatasi pada [0; 0,95]. Baseline ini memungkinkan antarmuka dan modul mitigasi diuji tanpa bergantung pada ketersediaan data latih.</w:t>
+        <w:t>dengan hasil dibatasi pada [0; 1]. Baseline ini memungkinkan antarmuka dan modul mitigasi diuji tanpa bergantung pada ketersediaan data latih.</w:t>
       </w:r>
     </w:p>
     <w:p>
@@ -1486,7 +1513,15 @@
         <w:t>bukan</w:t>
       </w:r>
       <w:r>
-        <w:t xml:space="preserve"> keluaran model: fitur OSM dan FIRMS per sel hanya tersedia di kotak demo. Peta ini karenanya bersifat indikatif, tidak menjalankan CA, dan diberi label eksplisit pada antarmuka. Lingkaran risiko hanya digambar pada sel yang pusatnya berada di daratan, memakai garis pantai Natural Earth 1:50m yang disederhanakan dan disimpan di </w:t>
+        <w:t xml:space="preserve"> keluaran model: fitur OSM dan FIRMS per sel hanya tersedia di kotak demo. Peta ini karenanya bersifat indikatif, tidak menjalankan CA, dan diberi label eksplisit pada antarmuka.</w:t>
+      </w:r>
+    </w:p>
+    <w:p>
+      <w:pPr>
+        <w:jc w:val="both"/>
+      </w:pPr>
+      <w:r>
+        <w:t xml:space="preserve">Lingkaran risiko hanya digambar pada sel yang pusatnya berada di daratan, memakai garis pantai Natural Earth 1:50m [12] yang disederhanakan dan disimpan di </w:t>
       </w:r>
       <w:r>
         <w:rPr>
@@ -1496,7 +1531,17 @@
         <w:t>assets/geo/kalimantan_land.geojson</w:t>
       </w:r>
       <w:r>
-        <w:t>; dari 5.313 sel pada kotak pembatas, 2.688 di antaranya berada di darat, sehingga Laut Jawa, Selat Karimata, dan Laut Cina Selatan tidak dipenuhi titik yang tidak memiliki bahan bakar.</w:t>
+        <w:t xml:space="preserve">. Dari 5.313 sel pada kotak pembatas, 2.688 di antaranya berada di darat, sehingga Laut Jawa, Selat Karimata, dan Laut Cina Selatan tidak dipenuhi titik yang tidak memiliki bahan bakar. Mask ini dihitung sekali saat peta dirender dan diperbarui dengan perintah </w:t>
+      </w:r>
+      <w:r>
+        <w:rPr>
+          <w:rFonts w:ascii="Consolas" w:hAnsi="Consolas"/>
+          <w:sz w:val="19"/>
+        </w:rPr>
+        <w:t>python -m src.land_mask build</w:t>
+      </w:r>
+      <w:r>
+        <w:t>.</w:t>
       </w:r>
     </w:p>
     <w:p>
@@ -2247,7 +2292,7 @@
             </w:pPr>
             <w:r/>
             <w:r>
-              <w:t>scikit-learn</w:t>
+              <w:t>scikit-learn, joblib</w:t>
             </w:r>
           </w:p>
         </w:tc>
@@ -2270,7 +2315,7 @@
               <w:t>Random Forest</w:t>
             </w:r>
             <w:r>
-              <w:t xml:space="preserve"> dan evaluasi metrik</w:t>
+              <w:t>, evaluasi metrik, penyimpanan model</w:t>
             </w:r>
           </w:p>
         </w:tc>
@@ -2315,6 +2360,50 @@
             <w:r/>
             <w:r>
               <w:t>Konteks lahan, titik panas, sebaran flora-fauna</w:t>
+            </w:r>
+          </w:p>
+        </w:tc>
+      </w:tr>
+      <w:tr>
+        <w:tc>
+          <w:tcPr>
+            <w:tcW w:type="dxa" w:w="2880"/>
+          </w:tcPr>
+          <w:p>
+            <w:pPr>
+              <w:spacing w:after="40"/>
+            </w:pPr>
+            <w:r/>
+            <w:r>
+              <w:t>Garis pantai</w:t>
+            </w:r>
+          </w:p>
+        </w:tc>
+        <w:tc>
+          <w:tcPr>
+            <w:tcW w:type="dxa" w:w="2880"/>
+          </w:tcPr>
+          <w:p>
+            <w:pPr>
+              <w:spacing w:after="40"/>
+            </w:pPr>
+            <w:r/>
+            <w:r>
+              <w:t>Natural Earth 1:50m (domain publik)</w:t>
+            </w:r>
+          </w:p>
+        </w:tc>
+        <w:tc>
+          <w:tcPr>
+            <w:tcW w:type="dxa" w:w="2880"/>
+          </w:tcPr>
+          <w:p>
+            <w:pPr>
+              <w:spacing w:after="40"/>
+            </w:pPr>
+            <w:r/>
+            <w:r>
+              <w:t>Mask daratan pada peta risiko pulau</w:t>
             </w:r>
           </w:p>
         </w:tc>
@@ -2446,7 +2535,7 @@
             </w:pPr>
             <w:r/>
             <w:r>
-              <w:t>Uji unit CA, fitur, mitigasi, ikon, dan asap integrasi</w:t>
+              <w:t>Uji unit CA, fitur, ML, mitigasi, ikon, mask daratan, dan asap integrasi</w:t>
             </w:r>
           </w:p>
         </w:tc>
@@ -2483,10 +2572,10 @@
           <w:rFonts w:ascii="Consolas" w:hAnsi="Consolas"/>
           <w:sz w:val="19"/>
         </w:rPr>
-        <w:t>joblib</w:t>
-      </w:r>
-      <w:r>
-        <w:t xml:space="preserve"> untuk penyimpanan model, serta </w:t>
+        <w:t>shapely</w:t>
+      </w:r>
+      <w:r>
+        <w:t xml:space="preserve"> untuk uji titik-dalam-poligon pada mask daratan, serta </w:t>
       </w:r>
       <w:r>
         <w:rPr>
@@ -2570,7 +2659,7 @@
         <w:t>Akuisisi data</w:t>
       </w:r>
       <w:r>
-        <w:t xml:space="preserve"> — Overpass API mengambil fitur air, jalan, permukiman, dan penutup lahan; NASA FIRMS menyediakan titik panas; iNaturalist API v2 menyediakan observasi flora-fauna dalam kotak Kalimantan.</w:t>
+        <w:t xml:space="preserve"> — Overpass API mengambil fitur air, permukiman, dan lahan gambut; NASA FIRMS menyediakan titik panas; iNaturalist API v2 menyediakan observasi flora-fauna dalam kotak Kalimantan.</w:t>
       </w:r>
     </w:p>
     <w:p>
@@ -2645,7 +2734,7 @@
         <w:t>Penyajian</w:t>
       </w:r>
       <w:r>
-        <w:t xml:space="preserve"> — peta sebaran biodiversitas, peta risiko Kalimantan, panel mitigasi, dan panel darurat dirender di Streamlit.</w:t>
+        <w:t xml:space="preserve"> — peta sebaran biodiversitas, peta risiko kotak demo hasil model, peta risiko Kalimantan, panel mitigasi, dan panel darurat dirender di Streamlit.</w:t>
       </w:r>
     </w:p>
     <w:p>
@@ -2811,7 +2900,7 @@
             </w:pPr>
             <w:r/>
             <w:r>
-              <w:t>Layer sungai/badan air, jalan, permukiman, dan fitur jarak</w:t>
+              <w:t>Layer sungai/badan air, permukiman, lahan gambut, dan fitur jarak</w:t>
             </w:r>
           </w:p>
         </w:tc>
@@ -2904,6 +2993,50 @@
           </w:p>
         </w:tc>
       </w:tr>
+      <w:tr>
+        <w:tc>
+          <w:tcPr>
+            <w:tcW w:type="dxa" w:w="2880"/>
+          </w:tcPr>
+          <w:p>
+            <w:pPr>
+              <w:spacing w:after="40"/>
+            </w:pPr>
+            <w:r/>
+            <w:r>
+              <w:t>Natural Earth</w:t>
+            </w:r>
+          </w:p>
+        </w:tc>
+        <w:tc>
+          <w:tcPr>
+            <w:tcW w:type="dxa" w:w="2880"/>
+          </w:tcPr>
+          <w:p>
+            <w:pPr>
+              <w:spacing w:after="40"/>
+            </w:pPr>
+            <w:r/>
+            <w:r>
+              <w:t>GeoJSON 1:50m (domain publik)</w:t>
+            </w:r>
+          </w:p>
+        </w:tc>
+        <w:tc>
+          <w:tcPr>
+            <w:tcW w:type="dxa" w:w="2880"/>
+          </w:tcPr>
+          <w:p>
+            <w:pPr>
+              <w:spacing w:after="40"/>
+            </w:pPr>
+            <w:r/>
+            <w:r>
+              <w:t>Garis pantai untuk mask daratan peta pulau</w:t>
+            </w:r>
+          </w:p>
+        </w:tc>
+      </w:tr>
     </w:tbl>
     <w:p/>
     <w:p>
@@ -2973,6 +3106,16 @@
         <w:t>src/features.py</w:t>
       </w:r>
       <w:r>
+        <w:t>), pelatihan (</w:t>
+      </w:r>
+      <w:r>
+        <w:rPr>
+          <w:rFonts w:ascii="Consolas" w:hAnsi="Consolas"/>
+          <w:sz w:val="19"/>
+        </w:rPr>
+        <w:t>src/train.py</w:t>
+      </w:r>
+      <w:r>
         <w:t>), data (</w:t>
       </w:r>
       <w:r>
@@ -3003,6 +3146,16 @@
         <w:t>src/bio_loader.py</w:t>
       </w:r>
       <w:r>
+        <w:t>), peta (</w:t>
+      </w:r>
+      <w:r>
+        <w:rPr>
+          <w:rFonts w:ascii="Consolas" w:hAnsi="Consolas"/>
+          <w:sz w:val="19"/>
+        </w:rPr>
+        <w:t>src/land_mask.py</w:t>
+      </w:r>
+      <w:r>
         <w:t>), logika mitigasi (</w:t>
       </w:r>
       <w:r>
@@ -3043,6 +3196,16 @@
         <w:t>src/config.py</w:t>
       </w:r>
       <w:r>
+        <w:t xml:space="preserve">, sedangkan artefak model disimpan di </w:t>
+      </w:r>
+      <w:r>
+        <w:rPr>
+          <w:rFonts w:ascii="Consolas" w:hAnsi="Consolas"/>
+          <w:sz w:val="19"/>
+        </w:rPr>
+        <w:t>models/</w:t>
+      </w:r>
+      <w:r>
         <w:t>.</w:t>
       </w:r>
     </w:p>
@@ -3140,7 +3303,7 @@
         <w:t>recall</w:t>
       </w:r>
       <w:r>
-        <w:t>, dan ROC-AUC. Umpan balik dari pengujian digunakan untuk mengoptimalkan kecepatan komputasi serta menyempurnakan tampilan dasbor hingga dihasilkan prototipe yang stabil, akurat, dan intuitif.</w:t>
+        <w:t>, ROC-AUC, dan PR-AUC. Umpan balik dari pengujian digunakan untuk mengoptimalkan kecepatan komputasi serta menyempurnakan tampilan dasbor hingga dihasilkan prototipe yang stabil, akurat, dan intuitif.</w:t>
       </w:r>
     </w:p>
     <w:p>
@@ -3164,7 +3327,7 @@
         <w:jc w:val="both"/>
       </w:pPr>
       <w:r>
-        <w:t>Prototipe INSIGHT berupa aplikasi web Streamlit yang menampilkan tiga lapisan utama:</w:t>
+        <w:t>Prototipe INSIGHT berupa aplikasi web Streamlit yang menampilkan empat lapisan utama:</w:t>
       </w:r>
     </w:p>
     <w:p>
@@ -3207,10 +3370,33 @@
         <w:rPr>
           <w:b/>
         </w:rPr>
-        <w:t>Peta risiko kebakaran Kalimantan</w:t>
-      </w:r>
-      <w:r>
-        <w:t xml:space="preserve"> — permukaan risiko kasar 0,15° (≈ 16,6 km per sel) yang dihitung dengan heuristik fisika yang sama seperti model demo.</w:t>
+        <w:t>Peta risiko kotak demo</w:t>
+      </w:r>
+      <w:r>
+        <w:t xml:space="preserve"> — probabilitas </w:t>
+      </w:r>
+      <w:r>
+        <w:rPr>
+          <w:i/>
+        </w:rPr>
+        <w:t>Random Forest</w:t>
+      </w:r>
+      <w:r>
+        <w:t xml:space="preserve"> per sel untuk hari setelah pengamatan FIRMS terakhir, dengan keterangan sumber, ROC-AUC, PR-AUC, dan tanggal kondisi riwayat titik panas.</w:t>
+      </w:r>
+    </w:p>
+    <w:p>
+      <w:pPr>
+        <w:pStyle w:val="ListNumber"/>
+      </w:pPr>
+      <w:r>
+        <w:rPr>
+          <w:b/>
+        </w:rPr>
+        <w:t>Peta risiko skala Kalimantan</w:t>
+      </w:r>
+      <w:r>
+        <w:t xml:space="preserve"> — permukaan risiko kasar 0,15° (≈ 16,6 km per sel) dari heuristik fisika, digambar hanya pada sel daratan.</w:t>
       </w:r>
     </w:p>
     <w:p>
@@ -3300,7 +3486,7 @@
         <w:t>default</w:t>
       </w:r>
       <w:r>
-        <w:t>), mendukung format PNG, WEBP, JPG, dan SVG. Registri ikon memilih format dengan prioritas PNG &gt; WEBP &gt; JPG &gt; SVG dan menyematkan gambar sebagai data URI sehingga peta tetap berfungsi tanpa server aset terpisah.</w:t>
+        <w:t>), mendukung format PNG, WEBP, JPG/JPEG, dan SVG. Registri ikon memilih format dengan prioritas PNG &gt; WEBP &gt; JPG/JPEG &gt; SVG dan menyematkan gambar sebagai data URI sehingga peta tetap berfungsi tanpa server aset terpisah.</w:t>
       </w:r>
     </w:p>
     <w:p>
@@ -3763,7 +3949,16 @@
         <w:t>b. Uji kinerja komputasi.</w:t>
       </w:r>
       <w:r>
-        <w:t xml:space="preserve"> Satu langkah CA pada grid 58 × 58 memerlukan waktu di bawah 2 milidetik; 12 langkah selesai dalam ≈ 0,014 detik pada mesin pengujian tim. Kebutuhan komputasi didominasi oleh pengambilan data jaringan (Overpass dan iNaturalist), bukan oleh CA. Karena itu, hasil inisialisasi disimpan dengan cache </w:t>
+        <w:t xml:space="preserve"> Satu langkah CA pada grid 58 × 58 memerlukan waktu di bawah 2 milidetik; 12 langkah selesai dalam ≈ 0,014 detik pada mesin pengujian tim. Inferensi </w:t>
+      </w:r>
+      <w:r>
+        <w:rPr>
+          <w:i/>
+        </w:rPr>
+        <w:t>Random Forest</w:t>
+      </w:r>
+      <w:r>
+        <w:t xml:space="preserve"> untuk seluruh 3.364 sel memerlukan ≈ 0,5 detik melalui salinan NumPy dari hutan model. Kebutuhan komputasi didominasi oleh pengambilan data jaringan (Overpass dan iNaturalist), bukan oleh CA atau model. Karena itu, hasil inisialisasi disimpan dengan cache </w:t>
       </w:r>
       <w:r>
         <w:rPr>
@@ -3810,7 +4005,7 @@
         <w:t>recall</w:t>
       </w:r>
       <w:r>
-        <w:t xml:space="preserve"> 0,166 (ambang 0,5), ROC-AUC 0,883, dan PR-AUC 0,283. PR-AUC jauh di atas laju positif menunjukkan model memberi peringkat yang berarti pada kelas minoritas, meskipun </w:t>
+        <w:t xml:space="preserve"> 0,166 (ambang 0,5), ROC-AUC 0,883, dan PR-AUC 0,283. PR-AUC hampir sembilan kali laju positif menunjukkan model memberi peringkat yang berarti pada kelas minoritas, meskipun </w:t>
       </w:r>
       <w:r>
         <w:rPr>
@@ -3819,7 +4014,15 @@
         <w:t>recall</w:t>
       </w:r>
       <w:r>
-        <w:t xml:space="preserve"> pada ambang 0,5 rendah—karena itu antarmuka menampilkan peta probabilitas bergradasi, bukan keputusan biner. Fitur terpenting adalah jarak ke titik panas hari sebelumnya (0,167), riwayat 3 hari (0,138), posisi baris (0,119), keselarasan angin (0,116), dan jumlah titik panas 7 hari (0,108). Pada peta kotak demo, 23 sel (0,7%) melewati probabilitas 0,5 dan nilai tertinggi 0,76.</w:t>
+        <w:t xml:space="preserve"> pada ambang 0,5 rendah—karena itu antarmuka menampilkan peta probabilitas bergradasi, bukan keputusan biner. Fitur terpenting adalah jarak ke titik panas hari sebelumnya (0,167), riwayat 3 hari (0,138), posisi baris (0,119), keselarasan angin (0,116), dan jumlah titik panas 7 hari (0,108).</w:t>
+      </w:r>
+    </w:p>
+    <w:p>
+      <w:pPr>
+        <w:jc w:val="both"/>
+      </w:pPr>
+      <w:r>
+        <w:t>Pada peta kotak demo, 23 sel (0,7%) melewati probabilitas 0,5 dengan nilai tertinggi 0,76, dan rata-rata probabilitas 0,036—hampir sama dengan laju positif teramati 3,2%, sehingga peta dapat dibaca sebagai probabilitas, bukan sekadar peringkat. Setelah pemeriksaan kebocoran label dan penggunaan pembagian temporal, angka-angka ini lebih rendah daripada versi awal prototipe, tetapi merupakan estimasi yang jujur untuk data yang tidak pernah dilihat model.</w:t>
       </w:r>
     </w:p>
     <w:p>
@@ -3843,7 +4046,17 @@
         <w:t>pytest</w:t>
       </w:r>
       <w:r>
-        <w:t xml:space="preserve"> mencakup 56 pengujian pada modul CA, fitur, ML, mitigasi, ikon, dan asap integrasi, seluruhnya lulus dalam ≈ 11 detik. Pengujian mencakup batas probabilitas 0,15–0,60, arah keselarasan angin (searah hembusan bernilai 1, berlawanan 0, tegak lurus 0,5), ketetanggan Moore, sifat bahan bakar yang tidak dapat terbakar ulang, akurasi jarak </w:t>
+        <w:t xml:space="preserve"> mencakup 69 pengujian pada modul CA, fitur, ML, mitigasi, ikon, mask daratan, dan asap integrasi, seluruhnya lulus dalam ≈ 15 detik. Pengujian mencakup batas probabilitas 0,15–0,60, arah keselarasan angin (searah hembusan bernilai 1, berlawanan 0, tegak lurus 0,5), ketetanggan Moore, sifat bahan bakar yang tidak dapat terbakar ulang, sel air yang tidak pernah menyala meski peluang penyulutan diset 1, sel </w:t>
+      </w:r>
+      <w:r>
+        <w:rPr>
+          <w:rFonts w:ascii="Consolas" w:hAnsi="Consolas"/>
+          <w:sz w:val="19"/>
+        </w:rPr>
+        <w:t>peat_risk</w:t>
+      </w:r>
+      <w:r>
+        <w:t xml:space="preserve"> yang tetap dapat terbakar, akurasi jarak </w:t>
       </w:r>
       <w:r>
         <w:rPr>
@@ -3852,7 +4065,7 @@
         <w:t>distance transform</w:t>
       </w:r>
       <w:r>
-        <w:t xml:space="preserve">, kebocoran label pada fitur riwayat, penyimpanan dan pemuatan model, serta pemetaan ikon dan fallback ke </w:t>
+        <w:t xml:space="preserve">, kebocoran label pada fitur riwayat, kesesuaian fitur riwayat saat inferensi, penolakan model usang, kesesuaian keluaran salinan NumPy dengan scikit-learn, penyimpanan dan pemuatan model, mask daratan peta pulau, serta pemetaan ikon dan fallback ke </w:t>
       </w:r>
       <w:r>
         <w:rPr>
@@ -3886,7 +4099,7 @@
         <w:t>tile.openstreetmap.org</w:t>
       </w:r>
       <w:r>
-        <w:t xml:space="preserve"> dan menutup penuh area peta tanpa celah. Waktu muat pertama bergantung pada pengambilan iNaturalist dan, bila cache OSM sudah kedaluwarsa (7 hari), Overpass; dengan cache tersedia inisialisasi selesai dalam hitungan detik.</w:t>
+        <w:t xml:space="preserve"> dan menutup penuh area peta tanpa celah. Waktu muat pertama bergantung pada pengambilan iNaturalist dan, bila cache OSM sudah kedaluwarsa (7 hari), Overpass; dengan cache tersedia inisialisasi selesai dalam hitungan detik. Rendering dasbor lengkap dengan dua peta terverifikasi tanpa pengecualian melalui pengujian Streamlit.</w:t>
       </w:r>
     </w:p>
     <w:p>
@@ -3908,7 +4121,7 @@
         <w:t>Teknis.</w:t>
       </w:r>
       <w:r>
-        <w:t xml:space="preserve"> Seluruh komponen berjalan di browser melalui Streamlit dan Folium, tanpa server GPU dan tanpa basis data. Model CA sangat ringan, sedangkan beban terbesar adalah ketersediaan jaringan dan kuota API publik. Ketergantungan pada Overpass API dan iNaturalist dapat digantikan data luring (stub) yang telah disediakan, sehingga demonstrasi tetap berjalan di lokasi tanpa internet.</w:t>
+        <w:t xml:space="preserve"> Seluruh komponen berjalan di browser melalui Streamlit dan Folium, tanpa server GPU dan tanpa basis data. Model CA sangat ringan, sedangkan beban terbesar adalah ketersediaan jaringan dan kuota API publik. Ketergantungan pada Overpass API dan iNaturalist dapat digantikan data luring (stub) yang telah disediakan, sehingga demonstrasi tetap berjalan di lokasi tanpa internet; model terlatih dan subset titik panas juga disertakan di repositori.</w:t>
       </w:r>
     </w:p>
     <w:p>
@@ -4016,10 +4229,10 @@
         <w:rPr>
           <w:b/>
         </w:rPr>
-        <w:t>Air belum menjadi penghalang api.</w:t>
-      </w:r>
-      <w:r>
-        <w:t xml:space="preserve"> Sel air dipakai sebagai fitur jarak dan dikeluarkan dari daftar area pedesaan, tetapi belum dijadikan sel tak-terbakar pada bidang CA.</w:t>
+        <w:t>Air hanya dimodelkan sebagai penghalang geometris.</w:t>
+      </w:r>
+      <w:r>
+        <w:t xml:space="preserve"> Sel air dari mask OpenStreetMap tidak dapat terbakar sehingga sungai dan danau memotong batas depan api, tetapi kelembapan bahan bakar, penguapan, dan hambatan hidrologis lain belum dimodelkan, dan mask gambut dibangun dari titik pusat fitur OSM sehingga poligon gambut besar hanya terwakili satu sel.</w:t>
       </w:r>
     </w:p>
     <w:p>
@@ -4030,7 +4243,7 @@
         <w:rPr>
           <w:b/>
         </w:rPr>
-        <w:t>Demo bergantung pada artefak model lokal.</w:t>
+        <w:t>Model adalah potret satu jendela data.</w:t>
       </w:r>
       <w:r>
         <w:t xml:space="preserve"> Model terlatih (</w:t>
@@ -4043,7 +4256,7 @@
         <w:t>models/risk_rf.joblib</w:t>
       </w:r>
       <w:r>
-        <w:t>, ≈ 4 MB) dan ekspor FIRMS (</w:t>
+        <w:t>, ≈ 4 MB) dan subset FIRMS (</w:t>
       </w:r>
       <w:r>
         <w:rPr>
@@ -4053,7 +4266,17 @@
         <w:t>data/raw/firms_hotspots.csv</w:t>
       </w:r>
       <w:r>
-        <w:t>) tidak ikut dalam repositori. Bila model tidak ada, aplikasi otomatis memakai baseline heuristik dan menyatakan sumbernya di panel samping. Bila berkas FIRMS tidak ada, model tetap dipakai tetapi fitur riwayat bernilai nol, sehingga peta menjadi prediksi "tanpa titik panas terbaru".</w:t>
+        <w:t xml:space="preserve">, 138 KB) disertakan di repositori agar aplikasi langsung memakai prediksi model, tetapi keduanya membekukan ekspor 7 hari pada Oktober 2026. Untuk musim baru, jalankan </w:t>
+      </w:r>
+      <w:r>
+        <w:rPr>
+          <w:rFonts w:ascii="Consolas" w:hAnsi="Consolas"/>
+          <w:sz w:val="19"/>
+        </w:rPr>
+        <w:t>python -m src.train</w:t>
+      </w:r>
+      <w:r>
+        <w:t xml:space="preserve"> dengan ekspor terbaru. Bila model tidak dapat dimuat, aplikasi otomatis memakai baseline heuristik dan menyatakan sumbernya di panel samping; bila berkas FIRMS tidak ada, fitur riwayat bernilai nol sehingga peta menjadi prediksi "tanpa titik panas terbaru".</w:t>
       </w:r>
     </w:p>
     <w:p>
@@ -4067,7 +4290,7 @@
         <w:t>Peta Kalimantan bersifat indikatif.</w:t>
       </w:r>
       <w:r>
-        <w:t xml:space="preserve"> Peta pulau memakai grid kasar dan heuristik, bukan CA atau model terlatih.</w:t>
+        <w:t xml:space="preserve"> Peta pulau memakai grid kasar dan heuristik, bukan CA atau model terlatih. Mask daratan hanya menghapus sel laut, bukan menggantikan model per sel.</w:t>
       </w:r>
     </w:p>
     <w:p>
@@ -4119,7 +4342,33 @@
         <w:pStyle w:val="ListNumber"/>
       </w:pPr>
       <w:r>
-        <w:t>Prototipe perangkat lunak INSIGHT berhasil dibangun sebagai aplikasi web interaktif yang menyajikan peta sebaran flora-fauna endemik, peta risiko kebakaran, panel mitigasi, dan panel darurat dalam satu dasbor, dengan seluruh ubin peta tertutup penuh dan parameter simulasi dapat diubah pengguna.</w:t>
+        <w:t xml:space="preserve">Prototipe perangkat lunak INSIGHT berhasil dibangun sebagai aplikasi web interaktif yang menyajikan peta sebaran flora-fauna endemik, peta risiko kotak demo hasil </w:t>
+      </w:r>
+      <w:r>
+        <w:rPr>
+          <w:i/>
+        </w:rPr>
+        <w:t>Random Forest</w:t>
+      </w:r>
+      <w:r>
+        <w:t>, peta risiko Kalimantan, panel mitigasi, dan panel darurat dalam satu dasbor.</w:t>
+      </w:r>
+    </w:p>
+    <w:p>
+      <w:pPr>
+        <w:pStyle w:val="ListNumber"/>
+      </w:pPr>
+      <w:r>
+        <w:t xml:space="preserve">Lapisan </w:t>
+      </w:r>
+      <w:r>
+        <w:rPr>
+          <w:i/>
+        </w:rPr>
+        <w:t>Machine Learning</w:t>
+      </w:r>
+      <w:r>
+        <w:t xml:space="preserve"> terbukti dapat dipakai, bukan sekadar dirancang: dilatih pada 1.770 titik panas FIRMS nyata dan dievaluasi pada dua hari yang tidak pernah dilihat model, model mencapai ROC-AUC 0,883 dan PR-AUC 0,283, lalu memuat dirinya saat aplikasi dijalankan dan mengondisikan peta pada hari terakhir pengamatan.</w:t>
       </w:r>
     </w:p>
     <w:p>
@@ -4330,6 +4579,23 @@
       </w:r>
       <w:r>
         <w:t>, https://python-visualization.github.io/folium/, (21 Oktober 2026).</w:t>
+      </w:r>
+    </w:p>
+    <w:p>
+      <w:pPr>
+        <w:jc w:val="both"/>
+      </w:pPr>
+      <w:r>
+        <w:t xml:space="preserve">[12] Natural Earth, </w:t>
+      </w:r>
+      <w:r>
+        <w:rPr>
+          <w:i/>
+        </w:rPr>
+        <w:t>1:50m Land</w:t>
+      </w:r>
+      <w:r>
+        <w:t>, https://www.naturalearthdata.com/downloads/50m-physical-vectors/, (domain publik, 21 Oktober 2026).</w:t>
       </w:r>
     </w:p>
     <w:p>
@@ -4888,7 +5154,7 @@
             </w:pPr>
             <w:r/>
             <w:r>
-              <w:t>Data geospasial publik (OSM, FIRMS, iNaturalist)</w:t>
+              <w:t>Data geospasial publik (OSM, FIRMS, iNaturalist, Natural Earth)</w:t>
             </w:r>
           </w:p>
         </w:tc>
@@ -5072,7 +5338,7 @@
         <w:t>src/features.py</w:t>
       </w:r>
       <w:r>
-        <w:t xml:space="preserve"> — tabel fitur dan </w:t>
+        <w:t xml:space="preserve"> — tabel fitur, riwayat titik panas, dan </w:t>
       </w:r>
       <w:r>
         <w:rPr>
@@ -5117,6 +5383,36 @@
           <w:rFonts w:ascii="Consolas" w:hAnsi="Consolas"/>
           <w:sz w:val="19"/>
         </w:rPr>
+        <w:t>src/train.py</w:t>
+      </w:r>
+      <w:r>
+        <w:t xml:space="preserve"> — CLI pelatihan dari ekspor FIRMS;</w:t>
+      </w:r>
+    </w:p>
+    <w:p>
+      <w:pPr>
+        <w:pStyle w:val="ListBullet"/>
+      </w:pPr>
+      <w:r>
+        <w:rPr>
+          <w:rFonts w:ascii="Consolas" w:hAnsi="Consolas"/>
+          <w:sz w:val="19"/>
+        </w:rPr>
+        <w:t>src/land_mask.py</w:t>
+      </w:r>
+      <w:r>
+        <w:t xml:space="preserve"> — mask daratan peta pulau dan pembangun garis pantai;</w:t>
+      </w:r>
+    </w:p>
+    <w:p>
+      <w:pPr>
+        <w:pStyle w:val="ListBullet"/>
+      </w:pPr>
+      <w:r>
+        <w:rPr>
+          <w:rFonts w:ascii="Consolas" w:hAnsi="Consolas"/>
+          <w:sz w:val="19"/>
+        </w:rPr>
         <w:t>src/mitigation.py</w:t>
       </w:r>
       <w:r>
@@ -5147,6 +5443,21 @@
           <w:rFonts w:ascii="Consolas" w:hAnsi="Consolas"/>
           <w:sz w:val="19"/>
         </w:rPr>
+        <w:t>app/ca_simulator.py</w:t>
+      </w:r>
+      <w:r>
+        <w:t xml:space="preserve"> — orkestrasi data, CA, model, dan mitigasi;</w:t>
+      </w:r>
+    </w:p>
+    <w:p>
+      <w:pPr>
+        <w:pStyle w:val="ListBullet"/>
+      </w:pPr>
+      <w:r>
+        <w:rPr>
+          <w:rFonts w:ascii="Consolas" w:hAnsi="Consolas"/>
+          <w:sz w:val="19"/>
+        </w:rPr>
         <w:t>app/main.py</w:t>
       </w:r>
       <w:r>
@@ -5165,7 +5476,7 @@
         <w:t>tests/</w:t>
       </w:r>
       <w:r>
-        <w:t xml:space="preserve"> — 56 pengujian unit dan asap (</w:t>
+        <w:t xml:space="preserve"> — 69 pengujian unit dan asap (</w:t>
       </w:r>
       <w:r>
         <w:rPr>
@@ -5183,7 +5494,7 @@
         <w:jc w:val="both"/>
       </w:pPr>
       <w:r>
-        <w:t xml:space="preserve">Berkas data mentah diletakkan di </w:t>
+        <w:t xml:space="preserve">Berkas data mentah berukuran besar diletakkan di </w:t>
       </w:r>
       <w:r>
         <w:rPr>
@@ -5193,17 +5504,27 @@
         <w:t>data/raw/</w:t>
       </w:r>
       <w:r>
-        <w:t xml:space="preserve"> (misalnya </w:t>
+        <w:t xml:space="preserve"> dan tidak disertakan dalam repositori, sedangkan subset FIRMS yang dipakai aplikasi (</w:t>
       </w:r>
       <w:r>
         <w:rPr>
           <w:rFonts w:ascii="Consolas" w:hAnsi="Consolas"/>
           <w:sz w:val="19"/>
         </w:rPr>
-        <w:t>firms_hotspots.csv</w:t>
-      </w:r>
-      <w:r>
-        <w:t xml:space="preserve">), sedangkan ikon kustom diletakkan di </w:t>
+        <w:t>data/raw/firms_hotspots.csv</w:t>
+      </w:r>
+      <w:r>
+        <w:t>), model terlatih (</w:t>
+      </w:r>
+      <w:r>
+        <w:rPr>
+          <w:rFonts w:ascii="Consolas" w:hAnsi="Consolas"/>
+          <w:sz w:val="19"/>
+        </w:rPr>
+        <w:t>models/</w:t>
+      </w:r>
+      <w:r>
+        <w:t>), ikon kustom (</w:t>
       </w:r>
       <w:r>
         <w:rPr>
@@ -5213,7 +5534,17 @@
         <w:t>assets/icons/</w:t>
       </w:r>
       <w:r>
-        <w:t>.</w:t>
+        <w:t>), dan garis pantai (</w:t>
+      </w:r>
+      <w:r>
+        <w:rPr>
+          <w:rFonts w:ascii="Consolas" w:hAnsi="Consolas"/>
+          <w:sz w:val="19"/>
+        </w:rPr>
+        <w:t>assets/geo/</w:t>
+      </w:r>
+      <w:r>
+        <w:t>) disertakan agar aplikasi dapat dijalankan tanpa pelatihan ulang.</w:t>
       </w:r>
     </w:p>
     <w:sectPr>

</xml_diff>